<commit_message>
Agregar sección Deportes con 6 noticias (Mundial 2026 y más)
</commit_message>
<xml_diff>
--- a/Documento_Final_NotiRed_APA7.docx
+++ b/Documento_Final_NotiRed_APA7.docx
@@ -404,7 +404,7 @@
         <w:ind w:firstLine="720"/>
       </w:pPr>
       <w:r>
-        <w:t>La plataforma permite explorar noticias de educación, tecnología, turismo y comercio; consultar el detalle de cada noticia; guardar favoritas para consulta posterior con persistencia en el navegador; contactar a la redacción mediante un formulario validado; y gestionar noticias con un mini-CRUD. El diseño mantiene la paleta azul y blanco con acentos naranja, tipografía limpia y enfoque en la experiencia del usuario.</w:t>
+        <w:t>La plataforma permite explorar noticias de educación, tecnología, turismo, comercio y deportes; consultar el detalle de cada noticia; guardar favoritas para consulta posterior con persistencia en el navegador; contactar a la redacción mediante un formulario validado; y gestionar noticias con un mini-CRUD. El diseño mantiene la paleta azul y blanco con acentos naranja, tipografía limpia y enfoque en la experiencia del usuario.</w:t>
       </w:r>
     </w:p>
     <w:p>
@@ -599,7 +599,7 @@
                 <w:rFonts w:ascii="Times New Roman" w:hAnsi="Times New Roman"/>
                 <w:sz w:val="20"/>
               </w:rPr>
-              <w:t>Educación, Tecnología, Turismo, Comercio</w:t>
+              <w:t>Educación, Tecnología, Turismo, Comercio, Deportes</w:t>
             </w:r>
           </w:p>
         </w:tc>
@@ -695,7 +695,7 @@
                 <w:rFonts w:ascii="Times New Roman" w:hAnsi="Times New Roman"/>
                 <w:sz w:val="20"/>
               </w:rPr>
-              <w:t>Archivo JSON local (assets/data/noticias.json, 10 noticias)</w:t>
+              <w:t>Archivo JSON local (assets/data/noticias.json, 16 noticias)</w:t>
             </w:r>
           </w:p>
         </w:tc>
@@ -892,6 +892,22 @@
       </w:pPr>
       <w:r>
         <w:t>Describe el proyecto, resume los componentes y bindings implementados, presenta la ficha (autor, módulo, datos, ejecución) y enlaza al catálogo y al contacto.</w:t>
+      </w:r>
+    </w:p>
+    <w:p>
+      <w:pPr>
+        <w:pStyle w:val="Heading2"/>
+      </w:pPr>
+      <w:r>
+        <w:t>3.8. Sección de deportes</w:t>
+      </w:r>
+    </w:p>
+    <w:p>
+      <w:pPr>
+        <w:ind w:firstLine="720"/>
+      </w:pPr>
+      <w:r>
+        <w:t>La categoría Deportes reúne seis noticias: balance del Mundial 2026, la campaña de la Selección Colombia, ciclismo, atletismo, fútbol femenino y patinaje. Dos de ellas son destacadas y aparecen en el Home; el resto se explora con filtros, búsqueda y paginación como cualquier categoría.</w:t>
       </w:r>
     </w:p>
     <w:p>
@@ -4413,7 +4429,7 @@
         <w:shd w:val="clear" w:fill="F2F2F2"/>
       </w:pPr>
       <w:r>
-        <w:t>... (80 líneas más — ver archivo src/app/features/listado/listado.component.html)</w:t>
+        <w:t>... (82 líneas más — ver archivo src/app/features/listado/listado.component.html)</w:t>
       </w:r>
     </w:p>
     <w:p>
@@ -4674,7 +4690,7 @@
         <w:shd w:val="clear" w:fill="F2F2F2"/>
       </w:pPr>
       <w:r>
-        <w:t xml:space="preserve">  categorias = ['Todas', 'Educación', 'Tecnología', 'Turismo', 'Comercio'];</w:t>
+        <w:t xml:space="preserve">  categorias = ['Todas', 'Educación', 'Tecnología', 'Turismo', 'Comercio', 'Deportes'];</w:t>
       </w:r>
     </w:p>
     <w:p>
@@ -4809,7 +4825,7 @@
         <w:shd w:val="clear" w:fill="F2F2F2"/>
       </w:pPr>
       <w:r>
-        <w:t xml:space="preserve">  conteo: Record&lt;string, number&gt; = { Educación: 0, Tecnología: 0, Turismo: 0, Comercio: 0 };</w:t>
+        <w:t xml:space="preserve">  conteo: Record&lt;string, number&gt; = { Educación: 0, Tecnología: 0, Turismo: 0, Comercio: 0, Deportes: 0 };</w:t>
       </w:r>
     </w:p>
     <w:p>
@@ -5370,7 +5386,7 @@
                 <w:rFonts w:ascii="Times New Roman" w:hAnsi="Times New Roman"/>
                 <w:sz w:val="20"/>
               </w:rPr>
-              <w:t>Catálogo base: 10 noticias, 4 destacadas</w:t>
+              <w:t>Catálogo base: 16 noticias, 6 destacadas (incluye Mundial 2026)</w:t>
             </w:r>
           </w:p>
         </w:tc>
@@ -5581,7 +5597,7 @@
         <w:shd w:val="clear" w:fill="F2F2F2"/>
       </w:pPr>
       <w:r>
-        <w:t>export type CategoriaNoticia = 'Educación' | 'Tecnología' | 'Turismo' | 'Comercio';</w:t>
+        <w:t>export type CategoriaNoticia = 'Educación' | 'Tecnología' | 'Turismo' | 'Comercio' | 'Deportes';</w:t>
       </w:r>
     </w:p>
     <w:p>
@@ -5859,7 +5875,7 @@
         <w:ind w:firstLine="720"/>
       </w:pPr>
       <w:r>
-        <w:t>Se verificaron manualmente los flujos principales con 10 noticias base. La Tabla 5 resume los casos, todos con resultado esperado satisfactorio: filtros, búsqueda, paginación, favorito (incluida persistencia tras recargar), crear/eliminar, validaciones de contacto y navegación por rutas y parámetro :id.</w:t>
+        <w:t>Se verificaron manualmente los flujos principales con 16 noticias base (6 de deportes, incluidas 2 del Mundial 2026). La Tabla 5 resume los casos, todos con resultado esperado satisfactorio: filtros, búsqueda, paginación, favorito (incluida persistencia tras recargar), crear/eliminar, validaciones de contacto y navegación por rutas y parámetro :id.</w:t>
       </w:r>
     </w:p>
     <w:p>
@@ -6483,7 +6499,7 @@
         <w:ind w:firstLine="0"/>
       </w:pPr>
       <w:r>
-        <w:t>JSON local para los datos del catálogo (10 noticias).</w:t>
+        <w:t>JSON local para los datos del catálogo (16 noticias, 5 categorías).</w:t>
       </w:r>
     </w:p>
     <w:p>

</xml_diff>